<commit_message>
Verify Publisher-rescue kit and link it from its niche
Re-ran the archive conversion on a copy: 9 of 10 sample files
converted with previews, index and contact sheet; the deliberately
damaged .pub fails with a clear reason.

Co-Authored-By: Claude Opus 5.5 <noreply@anthropic.com>
Claude-Session: https://claude.ai/code/session_01DspfyLwNfeJ4CHdyACeRHQ
</commit_message>
<xml_diff>
--- a/kits/redcap-xlsform/samples/04_codebook/lakeside_codebook.docx
+++ b/kits/redcap-xlsform/samples/04_codebook/lakeside_codebook.docx
@@ -857,6 +857,9 @@
       </w:r>
     </w:p>
     <w:p>
+      <w:pPr>
+        <w:keepNext/>
+      </w:pPr>
       <w:r>
         <w:rPr>
           <w:i/>
@@ -5344,6 +5347,9 @@
       </w:r>
     </w:p>
     <w:p>
+      <w:pPr>
+        <w:keepNext/>
+      </w:pPr>
       <w:r>
         <w:rPr>
           <w:i/>
@@ -6105,6 +6111,9 @@
       </w:r>
     </w:p>
     <w:p>
+      <w:pPr>
+        <w:keepNext/>
+      </w:pPr>
       <w:r>
         <w:rPr>
           <w:i/>
@@ -9006,6 +9015,9 @@
       </w:r>
     </w:p>
     <w:p>
+      <w:pPr>
+        <w:keepNext/>
+      </w:pPr>
       <w:r>
         <w:rPr>
           <w:i/>

</xml_diff>